<commit_message>
cập nhật lại setting
</commit_message>
<xml_diff>
--- a/DoAn_PyThon.docx
+++ b/DoAn_PyThon.docx
@@ -1801,7 +1801,13 @@
         <w:t>Nhìn vào nhu cầu đó, chúng em đã xây dựng nền tảng blog tin tức hướng đến các giới trẻ, không chỉ là các tin tức mà họ còn có thể tự viết bài của chính mình. Điều này không chỉ giúp đa dạng nguồn tin mà còn biến website từ một trang về tin tức trở thành nơi mà Cộng đồng chia sẻ và thảo luận về bài viết đó. Nơi giới trẻ được tư do sáng tạo, tăng tương tác và xây dựng hệ sinh thái tri thức của riêng mình nhưng vẫn nằm trong khuôn khổ đạo đức</w:t>
       </w:r>
       <w:r>
-        <w:t xml:space="preserve"> và kiểm duyệt chặt chẻ.</w:t>
+        <w:t xml:space="preserve"> và kiểm duyệt chặt ch</w:t>
+      </w:r>
+      <w:r>
+        <w:t>ẽ</w:t>
+      </w:r>
+      <w:r>
+        <w:t>.</w:t>
       </w:r>
     </w:p>
     <w:p>
@@ -1810,10 +1816,60 @@
       </w:pPr>
       <w:bookmarkStart w:id="3" w:name="_Toc226015285"/>
       <w:r>
+        <w:t>Mục đích nghiên cứu</w:t>
+      </w:r>
+      <w:bookmarkEnd w:id="3"/>
+    </w:p>
+    <w:p>
+      <w:r>
+        <w:t>Phát hiện ra cách giới trẻ tiếp cận thông tin hiện nay. Cụ thể, đề tài hướng đến các mục tiêu sau:</w:t>
+      </w:r>
+    </w:p>
+    <w:p>
+      <w:pPr>
+        <w:pStyle w:val="ListParagraph"/>
+        <w:numPr>
+          <w:ilvl w:val="0"/>
+          <w:numId w:val="10"/>
+        </w:numPr>
+      </w:pPr>
+      <w:r>
+        <w:t>Nghiên cứu hành vi, thói quen đọc tin tức và nhu cầu tương tác của th6e1 hệ trẻ. Tìm hiểu mô hình nội dung do người dùng tạo và cách thức tích hợp vào một trang tin tức điện tử</w:t>
+      </w:r>
+      <w:r>
+        <w:t>.</w:t>
+      </w:r>
+    </w:p>
+    <w:p>
+      <w:pPr>
+        <w:pStyle w:val="ListParagraph"/>
+        <w:numPr>
+          <w:ilvl w:val="0"/>
+          <w:numId w:val="10"/>
+        </w:numPr>
+      </w:pPr>
+      <w:r>
         <w:lastRenderedPageBreak/>
-        <w:t>Mục đích nghiên cứu</w:t>
-      </w:r>
-      <w:bookmarkEnd w:id="3"/>
+        <w:t>Ứng dụng các kiến thức đã học về lập trình Web (Python, Django, Cơ sở dữ liệu, …) để phân tích, thiết kế và xây dựng một nền tảng blog tin tức hoàn chỉnh</w:t>
+      </w:r>
+      <w:r>
+        <w:t>.</w:t>
+      </w:r>
+    </w:p>
+    <w:p>
+      <w:pPr>
+        <w:pStyle w:val="ListParagraph"/>
+        <w:numPr>
+          <w:ilvl w:val="0"/>
+          <w:numId w:val="10"/>
+        </w:numPr>
+      </w:pPr>
+      <w:r>
+        <w:t xml:space="preserve">Xây dựng hệ thống không chỉ cung cấp tin tức một chiều từ quản trị viên, mà còn cung cấp công cụ cho phép người dùng tự do </w:t>
+      </w:r>
+      <w:r>
+        <w:t>soạn thảo, đăng bài viết cá nhân, bình luận, đì kèm với cơ chế kiểm duyệt nội dung chặt chẽ.</w:t>
+      </w:r>
     </w:p>
     <w:p>
       <w:pPr>
@@ -1826,6 +1882,47 @@
       <w:bookmarkEnd w:id="4"/>
     </w:p>
     <w:p>
+      <w:r>
+        <w:t>Kết quả của đồ án không chỉ mang lại giá trị của bản thân mà còn lan tới cộng đồng.</w:t>
+      </w:r>
+    </w:p>
+    <w:p>
+      <w:pPr>
+        <w:pStyle w:val="ListParagraph"/>
+        <w:numPr>
+          <w:ilvl w:val="0"/>
+          <w:numId w:val="10"/>
+        </w:numPr>
+      </w:pPr>
+      <w:r>
+        <w:t>Đối với người dùng: cung cấp một không gian tin tức sôi động cho giới trẻ. Trao quyền cho người dùng thành những “nhà sáng tạo nội dung”, giúp họ nói lên quan điểm cá nhân và kết nối với người có cùng tâm sự.</w:t>
+      </w:r>
+    </w:p>
+    <w:p>
+      <w:pPr>
+        <w:pStyle w:val="ListParagraph"/>
+        <w:numPr>
+          <w:ilvl w:val="0"/>
+          <w:numId w:val="10"/>
+        </w:numPr>
+      </w:pPr>
+      <w:r>
+        <w:t>Đối với cộng đồng: xây dựng một hệ sinh thái thu nhỏ, nói các thông tin được cập nhật và truyển tải qua lăng kính trẻ trung nhưng vẫn đảm bảo tính văn minh và an toàn.</w:t>
+      </w:r>
+    </w:p>
+    <w:p>
+      <w:pPr>
+        <w:pStyle w:val="ListParagraph"/>
+        <w:numPr>
+          <w:ilvl w:val="0"/>
+          <w:numId w:val="10"/>
+        </w:numPr>
+      </w:pPr>
+      <w:r>
+        <w:t>Đối với nhóm thực hiện: là cơ hội để học hỏi những diều mới trong quá trình xây dựng website, làm việc nhóm cũng như hoàn thành mục tiêu mà cả nhóm đã đề ra.</w:t>
+      </w:r>
+    </w:p>
+    <w:p>
       <w:pPr>
         <w:pStyle w:val="Heading2"/>
       </w:pPr>
@@ -1836,6 +1933,83 @@
       <w:bookmarkEnd w:id="5"/>
     </w:p>
     <w:p>
+      <w:r>
+        <w:t>Để đảm bảo đồ án được hoàn thiện tốt nhất trong thời gian có hạn và nguồn lực cho phép, nhóm xác định phạm vi thực hiện như sau:</w:t>
+      </w:r>
+    </w:p>
+    <w:p>
+      <w:pPr>
+        <w:pStyle w:val="ListParagraph"/>
+        <w:numPr>
+          <w:ilvl w:val="0"/>
+          <w:numId w:val="10"/>
+        </w:numPr>
+      </w:pPr>
+      <w:r>
+        <w:t>Đối tượng hướng đến: người dùng internet, đặc biệt tập trung vào tệp người dùng trẻ có nhu cầu đọc, viết và chia sẽ tin tức.</w:t>
+      </w:r>
+    </w:p>
+    <w:p>
+      <w:pPr>
+        <w:pStyle w:val="ListParagraph"/>
+        <w:numPr>
+          <w:ilvl w:val="0"/>
+          <w:numId w:val="10"/>
+        </w:numPr>
+      </w:pPr>
+      <w:r>
+        <w:t>Phạm vi nội dung: tập trung vào các chuyên mục tin tức, xu hướng, công nghệ đời sống phù hợp với giới trẻ.</w:t>
+      </w:r>
+    </w:p>
+    <w:p>
+      <w:r>
+        <w:t>Phạm vi chức năng hệ thống:</w:t>
+      </w:r>
+    </w:p>
+    <w:p>
+      <w:pPr>
+        <w:pStyle w:val="ListParagraph"/>
+        <w:numPr>
+          <w:ilvl w:val="0"/>
+          <w:numId w:val="10"/>
+        </w:numPr>
+      </w:pPr>
+      <w:r>
+        <w:lastRenderedPageBreak/>
+        <w:t>Đối với người dùng: đăng ký/đăng nhập, xem tin tức theo danh mục, tự tạo bài viết mới, chỉnh sửa bài viết cá nhân, bình luận dưới các bài viết để tăng tuong tác.</w:t>
+      </w:r>
+    </w:p>
+    <w:p>
+      <w:pPr>
+        <w:pStyle w:val="ListParagraph"/>
+        <w:numPr>
+          <w:ilvl w:val="0"/>
+          <w:numId w:val="10"/>
+        </w:numPr>
+      </w:pPr>
+      <w:r>
+        <w:t>Đối với quản trị viên: quản lý tài khoản người dùng, quản lý danh mục, đăng tin tức chính thống.</w:t>
+      </w:r>
+    </w:p>
+    <w:p>
+      <w:r>
+        <w:t>Giới hạn đề tài:</w:t>
+      </w:r>
+    </w:p>
+    <w:p>
+      <w:pPr>
+        <w:pStyle w:val="ListParagraph"/>
+        <w:numPr>
+          <w:ilvl w:val="0"/>
+          <w:numId w:val="10"/>
+        </w:numPr>
+      </w:pPr>
+      <w:r>
+        <w:t>Hiện tại được phát triển dưới dạng Web Application và được tối ưa hóa cho mô hình hoạt động với lượng truy cập vừa và nhỏ.</w:t>
+      </w:r>
+    </w:p>
+    <w:p/>
+    <w:p>
       <w:pPr>
         <w:pStyle w:val="Heading1"/>
       </w:pPr>
@@ -1855,11 +2029,121 @@
       </w:r>
     </w:p>
     <w:p>
+      <w:r>
+        <w:t>Trong dự án này, nhóm sử dụng các ngôn ngữ lập trình phổ biến và tối ưa cho phát triển web hiện đại:</w:t>
+      </w:r>
+    </w:p>
+    <w:p>
+      <w:pPr>
+        <w:pStyle w:val="ListParagraph"/>
+        <w:numPr>
+          <w:ilvl w:val="0"/>
+          <w:numId w:val="10"/>
+        </w:numPr>
+      </w:pPr>
+      <w:r>
+        <w:t>Python: đây là ngôn ngữ lập trình chính được sử dụng để xử lý logic từ phái máy chủ (Backend). Cú pháp rõ ràng và gọn, thư viện hỗ trợ phong phú và tương thích cao với Framework Django.</w:t>
+      </w:r>
+    </w:p>
+    <w:p>
+      <w:pPr>
+        <w:pStyle w:val="ListParagraph"/>
+        <w:numPr>
+          <w:ilvl w:val="0"/>
+          <w:numId w:val="10"/>
+        </w:numPr>
+      </w:pPr>
+      <w:r>
+        <w:t>HTML: dùng để xâu dựng cấu trúc và nội dung cơ bản của trang web.</w:t>
+      </w:r>
+    </w:p>
+    <w:p>
+      <w:pPr>
+        <w:pStyle w:val="ListParagraph"/>
+        <w:numPr>
+          <w:ilvl w:val="0"/>
+          <w:numId w:val="10"/>
+        </w:numPr>
+      </w:pPr>
+      <w:r>
+        <w:t>CSS: thiết kế giao diện như màu sắc nhằm kích thích thị giác của người dùng, tăng trải nghiệm người dùng.</w:t>
+      </w:r>
+    </w:p>
+    <w:p>
+      <w:pPr>
+        <w:pStyle w:val="ListParagraph"/>
+        <w:numPr>
+          <w:ilvl w:val="0"/>
+          <w:numId w:val="10"/>
+        </w:numPr>
+      </w:pPr>
+      <w:r>
+        <w:t>JavaScript: (Frontend) tạo ra sự tương tác, giúp trang web trỏ nên sinh động và phản hồi nhanh chóng với hành vi của người dùng.</w:t>
+      </w:r>
+    </w:p>
+    <w:p>
       <w:pPr>
         <w:pStyle w:val="Heading3"/>
       </w:pPr>
       <w:r>
-        <w:t>Ngôn ngữ …</w:t>
+        <w:t>Công cụ và Framework</w:t>
+      </w:r>
+    </w:p>
+    <w:p>
+      <w:r>
+        <w:t>Nhóm em sử dụng các công cụ và nền tảng mạnh mẽ để rút ngắn thời gian phát triển và đảm bảo tính bảo mật:</w:t>
+      </w:r>
+    </w:p>
+    <w:p>
+      <w:pPr>
+        <w:pStyle w:val="ListParagraph"/>
+        <w:numPr>
+          <w:ilvl w:val="0"/>
+          <w:numId w:val="10"/>
+        </w:numPr>
+      </w:pPr>
+      <w:r>
+        <w:lastRenderedPageBreak/>
+        <w:t>Django Framework: quản lý hệ thống dự liệu, xử lý xác thực người dùng và bảo mật hệ thống theo mô hình MVT (Model-View-Template).</w:t>
+      </w:r>
+    </w:p>
+    <w:p>
+      <w:pPr>
+        <w:pStyle w:val="ListParagraph"/>
+        <w:numPr>
+          <w:ilvl w:val="0"/>
+          <w:numId w:val="10"/>
+        </w:numPr>
+      </w:pPr>
+      <w:r>
+        <w:t>Boostrap: hỗ trợ thiết kế giao diện, hiển thị mượt mà trên nhiều thiết bị từ máy tính đến di dộng.</w:t>
+      </w:r>
+    </w:p>
+    <w:p>
+      <w:pPr>
+        <w:pStyle w:val="ListParagraph"/>
+        <w:numPr>
+          <w:ilvl w:val="0"/>
+          <w:numId w:val="10"/>
+        </w:numPr>
+      </w:pPr>
+      <w:r>
+        <w:t>Git &amp; Github: quản lý mã nguồn và hỗ trợ làm việc nhóm, giúp lưu trữ các phiên bản code và kiểm soát lỗi hiệu quả.</w:t>
+      </w:r>
+    </w:p>
+    <w:p>
+      <w:pPr>
+        <w:pStyle w:val="ListParagraph"/>
+        <w:numPr>
+          <w:ilvl w:val="0"/>
+          <w:numId w:val="10"/>
+        </w:numPr>
+      </w:pPr>
+      <w:r>
+        <w:t>Visua Studio Code: môi trường lập trình chính để viết và quản lý mã nguồn</w:t>
+      </w:r>
+      <w:r>
+        <w:t>.</w:t>
       </w:r>
     </w:p>
     <w:p>
@@ -1867,7 +2151,304 @@
         <w:pStyle w:val="Heading3"/>
       </w:pPr>
       <w:r>
-        <w:t>Ngôn ngữ …</w:t>
+        <w:t>Lưu trữ</w:t>
+      </w:r>
+    </w:p>
+    <w:p>
+      <w:r>
+        <w:t>Để Website có thể hoạt động bình thường trên môi trường internet, nhóm đã sữ dụng giải pháp điện toán đám mây:</w:t>
+      </w:r>
+    </w:p>
+    <w:p>
+      <w:pPr>
+        <w:pStyle w:val="ListParagraph"/>
+        <w:numPr>
+          <w:ilvl w:val="0"/>
+          <w:numId w:val="10"/>
+        </w:numPr>
+      </w:pPr>
+      <w:r>
+        <w:t>Render: nền tảng Could dùng để triển khai toàn bộ mã nguồn Website. Đồng thời nhóm sử dụng dịch vụ PostgreSQL trên Render để thiết lập cơ sở dữ liệu chung, cho phép các thành viên trong nhóm cùng kết nối và thao tác trên một dự liệu hệ thống.</w:t>
+      </w:r>
+    </w:p>
+    <w:p>
+      <w:pPr>
+        <w:pStyle w:val="ListParagraph"/>
+        <w:numPr>
+          <w:ilvl w:val="0"/>
+          <w:numId w:val="10"/>
+        </w:numPr>
+      </w:pPr>
+      <w:r>
+        <w:t>Couldinary: giải pháp lưu trữ hình ảnh chuyên nghiệp trên đám mây. Thay vì lưu ảnh trực tiếp trên máy (dễ gây quá tải), nhóm sử dụng API của Couldinary để quản lý, tối ưa háo dung lượng và hiển thị hình ảnh với tốc độ cao.</w:t>
+      </w:r>
+    </w:p>
+    <w:p>
+      <w:pPr>
+        <w:pStyle w:val="Heading1"/>
+      </w:pPr>
+      <w:r>
+        <w:lastRenderedPageBreak/>
+        <w:t>CƠ SỞ DỮ LIỆU</w:t>
+      </w:r>
+    </w:p>
+    <w:p>
+      <w:pPr>
+        <w:pStyle w:val="Heading2"/>
+      </w:pPr>
+      <w:r>
+        <w:t>Sơ đồ cơ sở dữ liệu</w:t>
+      </w:r>
+    </w:p>
+    <w:p>
+      <w:pPr>
+        <w:keepNext/>
+      </w:pPr>
+      <w:r>
+        <w:drawing>
+          <wp:inline distT="0" distB="0" distL="0" distR="0" wp14:anchorId="65C4C7FD" wp14:editId="3A028086">
+            <wp:extent cx="5760720" cy="3256915"/>
+            <wp:effectExtent l="0" t="0" r="0" b="635"/>
+            <wp:docPr id="1" name="Picture 1"/>
+            <wp:cNvGraphicFramePr>
+              <a:graphicFrameLocks xmlns:a="http://schemas.openxmlformats.org/drawingml/2006/main" noChangeAspect="1"/>
+            </wp:cNvGraphicFramePr>
+            <a:graphic xmlns:a="http://schemas.openxmlformats.org/drawingml/2006/main">
+              <a:graphicData uri="http://schemas.openxmlformats.org/drawingml/2006/picture">
+                <pic:pic xmlns:pic="http://schemas.openxmlformats.org/drawingml/2006/picture">
+                  <pic:nvPicPr>
+                    <pic:cNvPr id="1" name=""/>
+                    <pic:cNvPicPr/>
+                  </pic:nvPicPr>
+                  <pic:blipFill>
+                    <a:blip r:embed="rId17"/>
+                    <a:stretch>
+                      <a:fillRect/>
+                    </a:stretch>
+                  </pic:blipFill>
+                  <pic:spPr>
+                    <a:xfrm>
+                      <a:off x="0" y="0"/>
+                      <a:ext cx="5760720" cy="3256915"/>
+                    </a:xfrm>
+                    <a:prstGeom prst="rect">
+                      <a:avLst/>
+                    </a:prstGeom>
+                  </pic:spPr>
+                </pic:pic>
+              </a:graphicData>
+            </a:graphic>
+          </wp:inline>
+        </w:drawing>
+      </w:r>
+    </w:p>
+    <w:p>
+      <w:pPr>
+        <w:pStyle w:val="Caption"/>
+        <w:jc w:val="center"/>
+      </w:pPr>
+      <w:r>
+        <w:t xml:space="preserve">Hình </w:t>
+      </w:r>
+      <w:r>
+        <w:fldChar w:fldCharType="begin"/>
+      </w:r>
+      <w:r>
+        <w:instrText xml:space="preserve"> SEQ Hình \* ARABIC </w:instrText>
+      </w:r>
+      <w:r>
+        <w:fldChar w:fldCharType="separate"/>
+      </w:r>
+      <w:r>
+        <w:rPr>
+          <w:noProof/>
+        </w:rPr>
+        <w:t>1</w:t>
+      </w:r>
+      <w:r>
+        <w:fldChar w:fldCharType="end"/>
+      </w:r>
+      <w:r>
+        <w:t xml:space="preserve"> Sơ đồ hệ thống blog – tic tức</w:t>
+      </w:r>
+    </w:p>
+    <w:p>
+      <w:pPr>
+        <w:pStyle w:val="Heading1"/>
+      </w:pPr>
+      <w:r>
+        <w:lastRenderedPageBreak/>
+        <w:t>CÁC TÍNH NĂNG</w:t>
+      </w:r>
+    </w:p>
+    <w:p>
+      <w:pPr>
+        <w:pStyle w:val="Heading2"/>
+      </w:pPr>
+      <w:r>
+        <w:t>Giao diện</w:t>
+      </w:r>
+    </w:p>
+    <w:p>
+      <w:pPr>
+        <w:keepNext/>
+      </w:pPr>
+      <w:r>
+        <w:rPr>
+          <w:noProof/>
+        </w:rPr>
+        <w:drawing>
+          <wp:inline distT="0" distB="0" distL="0" distR="0" wp14:anchorId="19ECE3A0" wp14:editId="63145286">
+            <wp:extent cx="5760720" cy="3240405"/>
+            <wp:effectExtent l="0" t="0" r="0" b="0"/>
+            <wp:docPr id="11" name="Picture 11"/>
+            <wp:cNvGraphicFramePr>
+              <a:graphicFrameLocks xmlns:a="http://schemas.openxmlformats.org/drawingml/2006/main" noChangeAspect="1"/>
+            </wp:cNvGraphicFramePr>
+            <a:graphic xmlns:a="http://schemas.openxmlformats.org/drawingml/2006/main">
+              <a:graphicData uri="http://schemas.openxmlformats.org/drawingml/2006/picture">
+                <pic:pic xmlns:pic="http://schemas.openxmlformats.org/drawingml/2006/picture">
+                  <pic:nvPicPr>
+                    <pic:cNvPr id="1" name=""/>
+                    <pic:cNvPicPr/>
+                  </pic:nvPicPr>
+                  <pic:blipFill>
+                    <a:blip r:embed="rId18"/>
+                    <a:stretch>
+                      <a:fillRect/>
+                    </a:stretch>
+                  </pic:blipFill>
+                  <pic:spPr>
+                    <a:xfrm>
+                      <a:off x="0" y="0"/>
+                      <a:ext cx="5760720" cy="3240405"/>
+                    </a:xfrm>
+                    <a:prstGeom prst="rect">
+                      <a:avLst/>
+                    </a:prstGeom>
+                  </pic:spPr>
+                </pic:pic>
+              </a:graphicData>
+            </a:graphic>
+          </wp:inline>
+        </w:drawing>
+      </w:r>
+    </w:p>
+    <w:p>
+      <w:pPr>
+        <w:pStyle w:val="Caption"/>
+        <w:jc w:val="center"/>
+      </w:pPr>
+      <w:r>
+        <w:t xml:space="preserve">Hình </w:t>
+      </w:r>
+      <w:r>
+        <w:fldChar w:fldCharType="begin"/>
+      </w:r>
+      <w:r>
+        <w:instrText xml:space="preserve"> SEQ Hình \* ARABIC </w:instrText>
+      </w:r>
+      <w:r>
+        <w:fldChar w:fldCharType="separate"/>
+      </w:r>
+      <w:r>
+        <w:rPr>
+          <w:noProof/>
+        </w:rPr>
+        <w:t>2</w:t>
+      </w:r>
+      <w:r>
+        <w:fldChar w:fldCharType="end"/>
+      </w:r>
+      <w:r>
+        <w:t xml:space="preserve"> Giao diện</w:t>
+      </w:r>
+      <w:r>
+        <w:t xml:space="preserve"> đầu trang và sanh sách bài viết</w:t>
+      </w:r>
+    </w:p>
+    <w:p>
+      <w:pPr>
+        <w:keepNext/>
+      </w:pPr>
+      <w:r>
+        <w:rPr>
+          <w:noProof/>
+        </w:rPr>
+        <w:drawing>
+          <wp:inline distT="0" distB="0" distL="0" distR="0" wp14:anchorId="34FBD814" wp14:editId="41232C91">
+            <wp:extent cx="5760720" cy="3240405"/>
+            <wp:effectExtent l="0" t="0" r="0" b="0"/>
+            <wp:docPr id="12" name="Picture 12"/>
+            <wp:cNvGraphicFramePr>
+              <a:graphicFrameLocks xmlns:a="http://schemas.openxmlformats.org/drawingml/2006/main" noChangeAspect="1"/>
+            </wp:cNvGraphicFramePr>
+            <a:graphic xmlns:a="http://schemas.openxmlformats.org/drawingml/2006/main">
+              <a:graphicData uri="http://schemas.openxmlformats.org/drawingml/2006/picture">
+                <pic:pic xmlns:pic="http://schemas.openxmlformats.org/drawingml/2006/picture">
+                  <pic:nvPicPr>
+                    <pic:cNvPr id="1" name=""/>
+                    <pic:cNvPicPr/>
+                  </pic:nvPicPr>
+                  <pic:blipFill>
+                    <a:blip r:embed="rId19"/>
+                    <a:stretch>
+                      <a:fillRect/>
+                    </a:stretch>
+                  </pic:blipFill>
+                  <pic:spPr>
+                    <a:xfrm>
+                      <a:off x="0" y="0"/>
+                      <a:ext cx="5760720" cy="3240405"/>
+                    </a:xfrm>
+                    <a:prstGeom prst="rect">
+                      <a:avLst/>
+                    </a:prstGeom>
+                  </pic:spPr>
+                </pic:pic>
+              </a:graphicData>
+            </a:graphic>
+          </wp:inline>
+        </w:drawing>
+      </w:r>
+    </w:p>
+    <w:p>
+      <w:pPr>
+        <w:pStyle w:val="Caption"/>
+        <w:jc w:val="center"/>
+      </w:pPr>
+      <w:r>
+        <w:t xml:space="preserve">Hình </w:t>
+      </w:r>
+      <w:r>
+        <w:fldChar w:fldCharType="begin"/>
+      </w:r>
+      <w:r>
+        <w:instrText xml:space="preserve"> SEQ Hình \* ARABIC </w:instrText>
+      </w:r>
+      <w:r>
+        <w:fldChar w:fldCharType="separate"/>
+      </w:r>
+      <w:r>
+        <w:rPr>
+          <w:noProof/>
+        </w:rPr>
+        <w:t>3</w:t>
+      </w:r>
+      <w:r>
+        <w:fldChar w:fldCharType="end"/>
+      </w:r>
+      <w:r>
+        <w:t xml:space="preserve"> giao diện footer</w:t>
+      </w:r>
+    </w:p>
+    <w:p>
+      <w:r>
+        <w:lastRenderedPageBreak/>
+        <w:t>Giao diện của blog – tin tức ưa tiên thiết kế theo phong cách tối giản, hiện đại và thân thiện với người dùng.</w:t>
+      </w:r>
+      <w:r>
+        <w:t xml:space="preserve"> Phần giao diện được chia thành 3 phần sau:</w:t>
       </w:r>
     </w:p>
     <w:p>
@@ -1875,25 +2456,394 @@
         <w:pStyle w:val="Heading3"/>
       </w:pPr>
       <w:r>
-        <w:t>Ngôn ngữ …</w:t>
-      </w:r>
-    </w:p>
-    <w:p>
-      <w:pPr>
-        <w:pStyle w:val="Heading1"/>
-      </w:pPr>
-      <w:r>
-        <w:t>CƠ SỞ DỮ LIỆU</w:t>
-      </w:r>
-    </w:p>
-    <w:p>
-      <w:pPr>
-        <w:pStyle w:val="Heading1"/>
-      </w:pPr>
-      <w:r>
-        <w:t>CÁC TÍNH NĂNG</w:t>
-      </w:r>
-    </w:p>
+        <w:t>Phần h</w:t>
+      </w:r>
+      <w:r>
+        <w:t>eader</w:t>
+      </w:r>
+    </w:p>
+    <w:p>
+      <w:r>
+        <w:t>Đây là khu vục mặt tiền, bao gồm các thành phần nhận diện và hỗ trợ cá nhân hóa.</w:t>
+      </w:r>
+    </w:p>
+    <w:p>
+      <w:r>
+        <w:t>Logo và lời chào:</w:t>
+      </w:r>
+    </w:p>
+    <w:p>
+      <w:pPr>
+        <w:pStyle w:val="ListParagraph"/>
+        <w:numPr>
+          <w:ilvl w:val="0"/>
+          <w:numId w:val="10"/>
+        </w:numPr>
+      </w:pPr>
+      <w:r>
+        <w:t>Nằm ở góc trái chính là logo của nhóm cùng với dòng chữ “CẬP NHẬT BÀI VIẾT MỖI NGÀY” chính là thương hiệu và mục tiêu cảu blog.</w:t>
+      </w:r>
+    </w:p>
+    <w:p>
+      <w:r>
+        <w:t>Công cụ tùy chỉnh giao diện:</w:t>
+      </w:r>
+    </w:p>
+    <w:p>
+      <w:pPr>
+        <w:pStyle w:val="ListParagraph"/>
+        <w:numPr>
+          <w:ilvl w:val="0"/>
+          <w:numId w:val="10"/>
+        </w:numPr>
+      </w:pPr>
+      <w:r>
+        <w:t>Nổi bật với biểu tượng mặt trăng cho phép người dùng tự do chuyển đổi linh hoạt giữa giao diện sáng và tối theo</w:t>
+      </w:r>
+      <w:r>
+        <w:t xml:space="preserve"> sở thích của mỗi người</w:t>
+      </w:r>
+      <w:r>
+        <w:t>.</w:t>
+      </w:r>
+    </w:p>
+    <w:p>
+      <w:pPr>
+        <w:keepNext/>
+      </w:pPr>
+      <w:r>
+        <w:rPr>
+          <w:noProof/>
+        </w:rPr>
+        <w:drawing>
+          <wp:inline distT="0" distB="0" distL="0" distR="0" wp14:anchorId="19D71598" wp14:editId="7D29215D">
+            <wp:extent cx="5760720" cy="3240405"/>
+            <wp:effectExtent l="0" t="0" r="0" b="0"/>
+            <wp:docPr id="13" name="Picture 13"/>
+            <wp:cNvGraphicFramePr>
+              <a:graphicFrameLocks xmlns:a="http://schemas.openxmlformats.org/drawingml/2006/main" noChangeAspect="1"/>
+            </wp:cNvGraphicFramePr>
+            <a:graphic xmlns:a="http://schemas.openxmlformats.org/drawingml/2006/main">
+              <a:graphicData uri="http://schemas.openxmlformats.org/drawingml/2006/picture">
+                <pic:pic xmlns:pic="http://schemas.openxmlformats.org/drawingml/2006/picture">
+                  <pic:nvPicPr>
+                    <pic:cNvPr id="1" name=""/>
+                    <pic:cNvPicPr/>
+                  </pic:nvPicPr>
+                  <pic:blipFill>
+                    <a:blip r:embed="rId20"/>
+                    <a:stretch>
+                      <a:fillRect/>
+                    </a:stretch>
+                  </pic:blipFill>
+                  <pic:spPr>
+                    <a:xfrm>
+                      <a:off x="0" y="0"/>
+                      <a:ext cx="5760720" cy="3240405"/>
+                    </a:xfrm>
+                    <a:prstGeom prst="rect">
+                      <a:avLst/>
+                    </a:prstGeom>
+                  </pic:spPr>
+                </pic:pic>
+              </a:graphicData>
+            </a:graphic>
+          </wp:inline>
+        </w:drawing>
+      </w:r>
+    </w:p>
+    <w:p>
+      <w:pPr>
+        <w:pStyle w:val="Caption"/>
+        <w:jc w:val="center"/>
+      </w:pPr>
+      <w:r>
+        <w:t xml:space="preserve">Hình </w:t>
+      </w:r>
+      <w:r>
+        <w:fldChar w:fldCharType="begin"/>
+      </w:r>
+      <w:r>
+        <w:instrText xml:space="preserve"> SEQ Hình \* ARABIC </w:instrText>
+      </w:r>
+      <w:r>
+        <w:fldChar w:fldCharType="separate"/>
+      </w:r>
+      <w:r>
+        <w:rPr>
+          <w:noProof/>
+        </w:rPr>
+        <w:t>4</w:t>
+      </w:r>
+      <w:r>
+        <w:fldChar w:fldCharType="end"/>
+      </w:r>
+      <w:r>
+        <w:t xml:space="preserve"> Giao diện tối</w:t>
+      </w:r>
+    </w:p>
+    <w:p>
+      <w:r>
+        <w:t>Khu vực tài khoản:</w:t>
+      </w:r>
+    </w:p>
+    <w:p>
+      <w:pPr>
+        <w:pStyle w:val="ListParagraph"/>
+        <w:numPr>
+          <w:ilvl w:val="0"/>
+          <w:numId w:val="10"/>
+        </w:numPr>
+      </w:pPr>
+      <w:r>
+        <w:t>Các nút “Đăng nhập” và “Đăng ký”, nơi người dùng đăng nhập vào tài khoản để có thể tạo bài viết của chính mình và bình luận bài viết. Nếu chưa có tài khoản thì có thể chọn đăng ký để tạo tài khoản.</w:t>
+      </w:r>
+    </w:p>
+    <w:p>
+      <w:r>
+        <w:lastRenderedPageBreak/>
+        <w:t>Ngay bên dưới mặt tiền chính là thanh điều hướng, là thanh công cụ trung tâm cung cấp lối tắt để người dùng tương tác với hệ thống</w:t>
+      </w:r>
+      <w:r>
+        <w:t xml:space="preserve"> bao gồm:</w:t>
+      </w:r>
+    </w:p>
+    <w:p>
+      <w:r>
+        <w:t>Nút home và Danh mục:</w:t>
+      </w:r>
+    </w:p>
+    <w:p>
+      <w:pPr>
+        <w:pStyle w:val="ListParagraph"/>
+        <w:numPr>
+          <w:ilvl w:val="0"/>
+          <w:numId w:val="10"/>
+        </w:numPr>
+      </w:pPr>
+      <w:r>
+        <w:t>Icon ngôi nhà giúp làm mới trang hoặc quay về màn hình chính từ bất kỳ đâu. Kế bên là phân loại bài viết theo danh mục.</w:t>
+      </w:r>
+    </w:p>
+    <w:p>
+      <w:r>
+        <w:t>Thanh tìm kiếm:</w:t>
+      </w:r>
+    </w:p>
+    <w:p>
+      <w:pPr>
+        <w:pStyle w:val="ListParagraph"/>
+        <w:numPr>
+          <w:ilvl w:val="0"/>
+          <w:numId w:val="10"/>
+        </w:numPr>
+      </w:pPr>
+      <w:r>
+        <w:t>Đặt ở giữa thanh điều hướng, cho phép người dùng nhập từ khóa để tra cứu nhanh tiêu đề hoặc bài viết theo nhu cầu cá nhân.</w:t>
+      </w:r>
+    </w:p>
+    <w:p>
+      <w:r>
+        <w:t>Nút “Viết bài”:</w:t>
+      </w:r>
+    </w:p>
+    <w:p>
+      <w:pPr>
+        <w:pStyle w:val="ListParagraph"/>
+        <w:numPr>
+          <w:ilvl w:val="0"/>
+          <w:numId w:val="10"/>
+        </w:numPr>
+      </w:pPr>
+      <w:r>
+        <w:t>Là nơi người dùng có thể chung tay góp sức tạo ra thêm bài viết</w:t>
+      </w:r>
+    </w:p>
+    <w:p>
+      <w:pPr>
+        <w:pStyle w:val="Heading3"/>
+      </w:pPr>
+      <w:r>
+        <w:t>Phần main</w:t>
+      </w:r>
+    </w:p>
+    <w:p>
+      <w:r>
+        <w:t>Đây là nơi hiển thị danh sách bài viết. Được trình bày dưới dạng thẻ bo góc gọn gàng. Mỗi thẻ cung cấp thông tin bao gồm:</w:t>
+      </w:r>
+    </w:p>
+    <w:p>
+      <w:pPr>
+        <w:pStyle w:val="ListParagraph"/>
+        <w:numPr>
+          <w:ilvl w:val="0"/>
+          <w:numId w:val="11"/>
+        </w:numPr>
+      </w:pPr>
+      <w:r>
+        <w:t>Hình ảnh thu nhỏ (Thumbnail)</w:t>
+      </w:r>
+      <w:r>
+        <w:t>.</w:t>
+      </w:r>
+    </w:p>
+    <w:p>
+      <w:pPr>
+        <w:pStyle w:val="ListParagraph"/>
+        <w:numPr>
+          <w:ilvl w:val="0"/>
+          <w:numId w:val="11"/>
+        </w:numPr>
+      </w:pPr>
+      <w:r>
+        <w:t>Tiêu đề bài viết</w:t>
+      </w:r>
+      <w:r>
+        <w:t>.</w:t>
+      </w:r>
+    </w:p>
+    <w:p>
+      <w:pPr>
+        <w:pStyle w:val="ListParagraph"/>
+        <w:numPr>
+          <w:ilvl w:val="0"/>
+          <w:numId w:val="11"/>
+        </w:numPr>
+      </w:pPr>
+      <w:r>
+        <w:t>Các thông tin dữ liệu:</w:t>
+      </w:r>
+    </w:p>
+    <w:p>
+      <w:pPr>
+        <w:pStyle w:val="ListParagraph"/>
+        <w:numPr>
+          <w:ilvl w:val="0"/>
+          <w:numId w:val="12"/>
+        </w:numPr>
+      </w:pPr>
+      <w:r>
+        <w:t>Danh mục.</w:t>
+      </w:r>
+    </w:p>
+    <w:p>
+      <w:pPr>
+        <w:pStyle w:val="ListParagraph"/>
+        <w:numPr>
+          <w:ilvl w:val="0"/>
+          <w:numId w:val="12"/>
+        </w:numPr>
+      </w:pPr>
+      <w:r>
+        <w:t>Tên tác giả.</w:t>
+      </w:r>
+    </w:p>
+    <w:p>
+      <w:pPr>
+        <w:pStyle w:val="ListParagraph"/>
+        <w:numPr>
+          <w:ilvl w:val="0"/>
+          <w:numId w:val="12"/>
+        </w:numPr>
+      </w:pPr>
+      <w:r>
+        <w:t>Ngày đăng.</w:t>
+      </w:r>
+    </w:p>
+    <w:p>
+      <w:pPr>
+        <w:pStyle w:val="ListParagraph"/>
+        <w:numPr>
+          <w:ilvl w:val="0"/>
+          <w:numId w:val="12"/>
+        </w:numPr>
+      </w:pPr>
+      <w:r>
+        <w:t>Hashtag.</w:t>
+      </w:r>
+    </w:p>
+    <w:p>
+      <w:pPr>
+        <w:pStyle w:val="ListParagraph"/>
+        <w:numPr>
+          <w:ilvl w:val="0"/>
+          <w:numId w:val="11"/>
+        </w:numPr>
+      </w:pPr>
+      <w:r>
+        <w:t>Nút “Xem bài viết” để truy cập vào nội dung bài viết.</w:t>
+      </w:r>
+    </w:p>
+    <w:p>
+      <w:pPr>
+        <w:pStyle w:val="Heading3"/>
+      </w:pPr>
+      <w:r>
+        <w:t>Phần footer</w:t>
+      </w:r>
+    </w:p>
+    <w:p>
+      <w:r>
+        <w:t>Thuộc khu vực cuối trang, cung cấp các thông tin liên hệ và nhà đầu tư của dự á</w:t>
+      </w:r>
+      <w:r>
+        <w:t xml:space="preserve"> gồm:</w:t>
+      </w:r>
+    </w:p>
+    <w:p>
+      <w:pPr>
+        <w:pStyle w:val="ListParagraph"/>
+        <w:numPr>
+          <w:ilvl w:val="0"/>
+          <w:numId w:val="10"/>
+        </w:numPr>
+      </w:pPr>
+      <w:r>
+        <w:t>Sinh viên thực hiện: liệt kê họ tên, mã số sinh viên của các thành viên trong nhóm phát triển.</w:t>
+      </w:r>
+    </w:p>
+    <w:p>
+      <w:pPr>
+        <w:pStyle w:val="ListParagraph"/>
+        <w:numPr>
+          <w:ilvl w:val="0"/>
+          <w:numId w:val="10"/>
+        </w:numPr>
+      </w:pPr>
+      <w:r>
+        <w:lastRenderedPageBreak/>
+        <w:t>Nhà đầu tư: thông tin tri ân Giảng viên hướng dẫn và đơn vị đào tạo.</w:t>
+      </w:r>
+    </w:p>
+    <w:p>
+      <w:pPr>
+        <w:pStyle w:val="ListParagraph"/>
+        <w:numPr>
+          <w:ilvl w:val="0"/>
+          <w:numId w:val="10"/>
+        </w:numPr>
+      </w:pPr>
+      <w:r>
+        <w:t>Thông tin dự án: định danh tổ chức phát triển, địa chỉ và bản quyền của Website.</w:t>
+      </w:r>
+    </w:p>
+    <w:p>
+      <w:pPr>
+        <w:pStyle w:val="Heading2"/>
+      </w:pPr>
+      <w:r>
+        <w:t>Tính năng đăng nhập/đăng ký</w:t>
+      </w:r>
+    </w:p>
+    <w:p>
+      <w:pPr>
+        <w:pStyle w:val="Heading3"/>
+      </w:pPr>
+      <w:r>
+        <w:t>Đăng nhập</w:t>
+      </w:r>
+    </w:p>
+    <w:p/>
     <w:p>
       <w:pPr>
         <w:pStyle w:val="Heading1"/>
@@ -2333,6 +3283,181 @@
     </w:lvl>
   </w:abstractNum>
   <w:abstractNum w:abstractNumId="2" w15:restartNumberingAfterBreak="0">
+    <w:nsid w:val="187504CA"/>
+    <w:multiLevelType w:val="hybridMultilevel"/>
+    <w:tmpl w:val="C7EC2F3E"/>
+    <w:lvl w:ilvl="0" w:tplc="04090001">
+      <w:start w:val="1"/>
+      <w:numFmt w:val="bullet"/>
+      <w:lvlText w:val=""/>
+      <w:lvlJc w:val="left"/>
+      <w:pPr>
+        <w:ind w:left="1080" w:hanging="360"/>
+      </w:pPr>
+      <w:rPr>
+        <w:rFonts w:ascii="Symbol" w:hAnsi="Symbol" w:hint="default"/>
+      </w:rPr>
+    </w:lvl>
+    <w:lvl w:ilvl="1" w:tplc="FFFFFFFF" w:tentative="1">
+      <w:start w:val="1"/>
+      <w:numFmt w:val="lowerLetter"/>
+      <w:lvlText w:val="%2."/>
+      <w:lvlJc w:val="left"/>
+      <w:pPr>
+        <w:ind w:left="1800" w:hanging="360"/>
+      </w:pPr>
+    </w:lvl>
+    <w:lvl w:ilvl="2" w:tplc="FFFFFFFF" w:tentative="1">
+      <w:start w:val="1"/>
+      <w:numFmt w:val="lowerRoman"/>
+      <w:lvlText w:val="%3."/>
+      <w:lvlJc w:val="right"/>
+      <w:pPr>
+        <w:ind w:left="2520" w:hanging="180"/>
+      </w:pPr>
+    </w:lvl>
+    <w:lvl w:ilvl="3" w:tplc="FFFFFFFF" w:tentative="1">
+      <w:start w:val="1"/>
+      <w:numFmt w:val="decimal"/>
+      <w:lvlText w:val="%4."/>
+      <w:lvlJc w:val="left"/>
+      <w:pPr>
+        <w:ind w:left="3240" w:hanging="360"/>
+      </w:pPr>
+    </w:lvl>
+    <w:lvl w:ilvl="4" w:tplc="FFFFFFFF" w:tentative="1">
+      <w:start w:val="1"/>
+      <w:numFmt w:val="lowerLetter"/>
+      <w:lvlText w:val="%5."/>
+      <w:lvlJc w:val="left"/>
+      <w:pPr>
+        <w:ind w:left="3960" w:hanging="360"/>
+      </w:pPr>
+    </w:lvl>
+    <w:lvl w:ilvl="5" w:tplc="FFFFFFFF" w:tentative="1">
+      <w:start w:val="1"/>
+      <w:numFmt w:val="lowerRoman"/>
+      <w:lvlText w:val="%6."/>
+      <w:lvlJc w:val="right"/>
+      <w:pPr>
+        <w:ind w:left="4680" w:hanging="180"/>
+      </w:pPr>
+    </w:lvl>
+    <w:lvl w:ilvl="6" w:tplc="FFFFFFFF" w:tentative="1">
+      <w:start w:val="1"/>
+      <w:numFmt w:val="decimal"/>
+      <w:lvlText w:val="%7."/>
+      <w:lvlJc w:val="left"/>
+      <w:pPr>
+        <w:ind w:left="5400" w:hanging="360"/>
+      </w:pPr>
+    </w:lvl>
+    <w:lvl w:ilvl="7" w:tplc="FFFFFFFF" w:tentative="1">
+      <w:start w:val="1"/>
+      <w:numFmt w:val="lowerLetter"/>
+      <w:lvlText w:val="%8."/>
+      <w:lvlJc w:val="left"/>
+      <w:pPr>
+        <w:ind w:left="6120" w:hanging="360"/>
+      </w:pPr>
+    </w:lvl>
+    <w:lvl w:ilvl="8" w:tplc="FFFFFFFF" w:tentative="1">
+      <w:start w:val="1"/>
+      <w:numFmt w:val="lowerRoman"/>
+      <w:lvlText w:val="%9."/>
+      <w:lvlJc w:val="right"/>
+      <w:pPr>
+        <w:ind w:left="6840" w:hanging="180"/>
+      </w:pPr>
+    </w:lvl>
+  </w:abstractNum>
+  <w:abstractNum w:abstractNumId="3" w15:restartNumberingAfterBreak="0">
+    <w:nsid w:val="1A7A742C"/>
+    <w:multiLevelType w:val="hybridMultilevel"/>
+    <w:tmpl w:val="0FCC66A8"/>
+    <w:lvl w:ilvl="0" w:tplc="0409000F">
+      <w:start w:val="1"/>
+      <w:numFmt w:val="decimal"/>
+      <w:lvlText w:val="%1."/>
+      <w:lvlJc w:val="left"/>
+      <w:pPr>
+        <w:ind w:left="720" w:hanging="360"/>
+      </w:pPr>
+    </w:lvl>
+    <w:lvl w:ilvl="1" w:tplc="04090019" w:tentative="1">
+      <w:start w:val="1"/>
+      <w:numFmt w:val="lowerLetter"/>
+      <w:lvlText w:val="%2."/>
+      <w:lvlJc w:val="left"/>
+      <w:pPr>
+        <w:ind w:left="1440" w:hanging="360"/>
+      </w:pPr>
+    </w:lvl>
+    <w:lvl w:ilvl="2" w:tplc="0409001B" w:tentative="1">
+      <w:start w:val="1"/>
+      <w:numFmt w:val="lowerRoman"/>
+      <w:lvlText w:val="%3."/>
+      <w:lvlJc w:val="right"/>
+      <w:pPr>
+        <w:ind w:left="2160" w:hanging="180"/>
+      </w:pPr>
+    </w:lvl>
+    <w:lvl w:ilvl="3" w:tplc="0409000F" w:tentative="1">
+      <w:start w:val="1"/>
+      <w:numFmt w:val="decimal"/>
+      <w:lvlText w:val="%4."/>
+      <w:lvlJc w:val="left"/>
+      <w:pPr>
+        <w:ind w:left="2880" w:hanging="360"/>
+      </w:pPr>
+    </w:lvl>
+    <w:lvl w:ilvl="4" w:tplc="04090019" w:tentative="1">
+      <w:start w:val="1"/>
+      <w:numFmt w:val="lowerLetter"/>
+      <w:lvlText w:val="%5."/>
+      <w:lvlJc w:val="left"/>
+      <w:pPr>
+        <w:ind w:left="3600" w:hanging="360"/>
+      </w:pPr>
+    </w:lvl>
+    <w:lvl w:ilvl="5" w:tplc="0409001B" w:tentative="1">
+      <w:start w:val="1"/>
+      <w:numFmt w:val="lowerRoman"/>
+      <w:lvlText w:val="%6."/>
+      <w:lvlJc w:val="right"/>
+      <w:pPr>
+        <w:ind w:left="4320" w:hanging="180"/>
+      </w:pPr>
+    </w:lvl>
+    <w:lvl w:ilvl="6" w:tplc="0409000F" w:tentative="1">
+      <w:start w:val="1"/>
+      <w:numFmt w:val="decimal"/>
+      <w:lvlText w:val="%7."/>
+      <w:lvlJc w:val="left"/>
+      <w:pPr>
+        <w:ind w:left="5040" w:hanging="360"/>
+      </w:pPr>
+    </w:lvl>
+    <w:lvl w:ilvl="7" w:tplc="04090019" w:tentative="1">
+      <w:start w:val="1"/>
+      <w:numFmt w:val="lowerLetter"/>
+      <w:lvlText w:val="%8."/>
+      <w:lvlJc w:val="left"/>
+      <w:pPr>
+        <w:ind w:left="5760" w:hanging="360"/>
+      </w:pPr>
+    </w:lvl>
+    <w:lvl w:ilvl="8" w:tplc="0409001B" w:tentative="1">
+      <w:start w:val="1"/>
+      <w:numFmt w:val="lowerRoman"/>
+      <w:lvlText w:val="%9."/>
+      <w:lvlJc w:val="right"/>
+      <w:pPr>
+        <w:ind w:left="6480" w:hanging="180"/>
+      </w:pPr>
+    </w:lvl>
+  </w:abstractNum>
+  <w:abstractNum w:abstractNumId="4" w15:restartNumberingAfterBreak="0">
     <w:nsid w:val="1D96440E"/>
     <w:multiLevelType w:val="multilevel"/>
     <w:tmpl w:val="53B60014"/>
@@ -2454,7 +3579,7 @@
       </w:rPr>
     </w:lvl>
   </w:abstractNum>
-  <w:abstractNum w:abstractNumId="3" w15:restartNumberingAfterBreak="0">
+  <w:abstractNum w:abstractNumId="5" w15:restartNumberingAfterBreak="0">
     <w:nsid w:val="38F12B03"/>
     <w:multiLevelType w:val="hybridMultilevel"/>
     <w:tmpl w:val="7F648B06"/>
@@ -2540,7 +3665,7 @@
       </w:pPr>
     </w:lvl>
   </w:abstractNum>
-  <w:abstractNum w:abstractNumId="4" w15:restartNumberingAfterBreak="0">
+  <w:abstractNum w:abstractNumId="6" w15:restartNumberingAfterBreak="0">
     <w:nsid w:val="43AD1943"/>
     <w:multiLevelType w:val="hybridMultilevel"/>
     <w:tmpl w:val="AD18EF08"/>
@@ -2653,7 +3778,7 @@
       </w:rPr>
     </w:lvl>
   </w:abstractNum>
-  <w:abstractNum w:abstractNumId="5" w15:restartNumberingAfterBreak="0">
+  <w:abstractNum w:abstractNumId="7" w15:restartNumberingAfterBreak="0">
     <w:nsid w:val="56095341"/>
     <w:multiLevelType w:val="hybridMultilevel"/>
     <w:tmpl w:val="B4802C2E"/>
@@ -2766,7 +3891,7 @@
       </w:rPr>
     </w:lvl>
   </w:abstractNum>
-  <w:abstractNum w:abstractNumId="6" w15:restartNumberingAfterBreak="0">
+  <w:abstractNum w:abstractNumId="8" w15:restartNumberingAfterBreak="0">
     <w:nsid w:val="5924784C"/>
     <w:multiLevelType w:val="hybridMultilevel"/>
     <w:tmpl w:val="219EF898"/>
@@ -2879,7 +4004,7 @@
       </w:rPr>
     </w:lvl>
   </w:abstractNum>
-  <w:abstractNum w:abstractNumId="7" w15:restartNumberingAfterBreak="0">
+  <w:abstractNum w:abstractNumId="9" w15:restartNumberingAfterBreak="0">
     <w:nsid w:val="5953195D"/>
     <w:multiLevelType w:val="hybridMultilevel"/>
     <w:tmpl w:val="B532CA5C"/>
@@ -2992,7 +4117,119 @@
       </w:rPr>
     </w:lvl>
   </w:abstractNum>
-  <w:abstractNum w:abstractNumId="8" w15:restartNumberingAfterBreak="0">
+  <w:abstractNum w:abstractNumId="10" w15:restartNumberingAfterBreak="0">
+    <w:nsid w:val="66B6116A"/>
+    <w:multiLevelType w:val="hybridMultilevel"/>
+    <w:tmpl w:val="DB1ECD00"/>
+    <w:lvl w:ilvl="0" w:tplc="94002F9C">
+      <w:numFmt w:val="bullet"/>
+      <w:lvlText w:val="-"/>
+      <w:lvlJc w:val="left"/>
+      <w:pPr>
+        <w:ind w:left="720" w:hanging="360"/>
+      </w:pPr>
+      <w:rPr>
+        <w:rFonts w:ascii="Times New Roman" w:eastAsiaTheme="minorHAnsi" w:hAnsi="Times New Roman" w:cs="Times New Roman" w:hint="default"/>
+      </w:rPr>
+    </w:lvl>
+    <w:lvl w:ilvl="1" w:tplc="04090003" w:tentative="1">
+      <w:start w:val="1"/>
+      <w:numFmt w:val="bullet"/>
+      <w:lvlText w:val="o"/>
+      <w:lvlJc w:val="left"/>
+      <w:pPr>
+        <w:ind w:left="1440" w:hanging="360"/>
+      </w:pPr>
+      <w:rPr>
+        <w:rFonts w:ascii="Courier New" w:hAnsi="Courier New" w:cs="Courier New" w:hint="default"/>
+      </w:rPr>
+    </w:lvl>
+    <w:lvl w:ilvl="2" w:tplc="04090005" w:tentative="1">
+      <w:start w:val="1"/>
+      <w:numFmt w:val="bullet"/>
+      <w:lvlText w:val=""/>
+      <w:lvlJc w:val="left"/>
+      <w:pPr>
+        <w:ind w:left="2160" w:hanging="360"/>
+      </w:pPr>
+      <w:rPr>
+        <w:rFonts w:ascii="Wingdings" w:hAnsi="Wingdings" w:hint="default"/>
+      </w:rPr>
+    </w:lvl>
+    <w:lvl w:ilvl="3" w:tplc="04090001" w:tentative="1">
+      <w:start w:val="1"/>
+      <w:numFmt w:val="bullet"/>
+      <w:lvlText w:val=""/>
+      <w:lvlJc w:val="left"/>
+      <w:pPr>
+        <w:ind w:left="2880" w:hanging="360"/>
+      </w:pPr>
+      <w:rPr>
+        <w:rFonts w:ascii="Symbol" w:hAnsi="Symbol" w:hint="default"/>
+      </w:rPr>
+    </w:lvl>
+    <w:lvl w:ilvl="4" w:tplc="04090003" w:tentative="1">
+      <w:start w:val="1"/>
+      <w:numFmt w:val="bullet"/>
+      <w:lvlText w:val="o"/>
+      <w:lvlJc w:val="left"/>
+      <w:pPr>
+        <w:ind w:left="3600" w:hanging="360"/>
+      </w:pPr>
+      <w:rPr>
+        <w:rFonts w:ascii="Courier New" w:hAnsi="Courier New" w:cs="Courier New" w:hint="default"/>
+      </w:rPr>
+    </w:lvl>
+    <w:lvl w:ilvl="5" w:tplc="04090005" w:tentative="1">
+      <w:start w:val="1"/>
+      <w:numFmt w:val="bullet"/>
+      <w:lvlText w:val=""/>
+      <w:lvlJc w:val="left"/>
+      <w:pPr>
+        <w:ind w:left="4320" w:hanging="360"/>
+      </w:pPr>
+      <w:rPr>
+        <w:rFonts w:ascii="Wingdings" w:hAnsi="Wingdings" w:hint="default"/>
+      </w:rPr>
+    </w:lvl>
+    <w:lvl w:ilvl="6" w:tplc="04090001" w:tentative="1">
+      <w:start w:val="1"/>
+      <w:numFmt w:val="bullet"/>
+      <w:lvlText w:val=""/>
+      <w:lvlJc w:val="left"/>
+      <w:pPr>
+        <w:ind w:left="5040" w:hanging="360"/>
+      </w:pPr>
+      <w:rPr>
+        <w:rFonts w:ascii="Symbol" w:hAnsi="Symbol" w:hint="default"/>
+      </w:rPr>
+    </w:lvl>
+    <w:lvl w:ilvl="7" w:tplc="04090003" w:tentative="1">
+      <w:start w:val="1"/>
+      <w:numFmt w:val="bullet"/>
+      <w:lvlText w:val="o"/>
+      <w:lvlJc w:val="left"/>
+      <w:pPr>
+        <w:ind w:left="5760" w:hanging="360"/>
+      </w:pPr>
+      <w:rPr>
+        <w:rFonts w:ascii="Courier New" w:hAnsi="Courier New" w:cs="Courier New" w:hint="default"/>
+      </w:rPr>
+    </w:lvl>
+    <w:lvl w:ilvl="8" w:tplc="04090005" w:tentative="1">
+      <w:start w:val="1"/>
+      <w:numFmt w:val="bullet"/>
+      <w:lvlText w:val=""/>
+      <w:lvlJc w:val="left"/>
+      <w:pPr>
+        <w:ind w:left="6480" w:hanging="360"/>
+      </w:pPr>
+      <w:rPr>
+        <w:rFonts w:ascii="Wingdings" w:hAnsi="Wingdings" w:hint="default"/>
+      </w:rPr>
+    </w:lvl>
+  </w:abstractNum>
+  <w:abstractNum w:abstractNumId="11" w15:restartNumberingAfterBreak="0">
     <w:nsid w:val="72847722"/>
     <w:multiLevelType w:val="multilevel"/>
     <w:tmpl w:val="04090025"/>
@@ -3079,31 +4316,40 @@
     </w:lvl>
   </w:abstractNum>
   <w:num w:numId="1" w16cid:durableId="1048914273">
-    <w:abstractNumId w:val="2"/>
+    <w:abstractNumId w:val="4"/>
   </w:num>
   <w:num w:numId="2" w16cid:durableId="1734355576">
-    <w:abstractNumId w:val="8"/>
+    <w:abstractNumId w:val="11"/>
   </w:num>
   <w:num w:numId="3" w16cid:durableId="876357819">
-    <w:abstractNumId w:val="3"/>
+    <w:abstractNumId w:val="5"/>
   </w:num>
   <w:num w:numId="4" w16cid:durableId="738097308">
-    <w:abstractNumId w:val="7"/>
+    <w:abstractNumId w:val="9"/>
   </w:num>
   <w:num w:numId="5" w16cid:durableId="1972174872">
-    <w:abstractNumId w:val="4"/>
+    <w:abstractNumId w:val="6"/>
   </w:num>
   <w:num w:numId="6" w16cid:durableId="1252548986">
     <w:abstractNumId w:val="1"/>
   </w:num>
   <w:num w:numId="7" w16cid:durableId="1725519757">
-    <w:abstractNumId w:val="5"/>
+    <w:abstractNumId w:val="7"/>
   </w:num>
   <w:num w:numId="8" w16cid:durableId="1853570185">
-    <w:abstractNumId w:val="6"/>
+    <w:abstractNumId w:val="8"/>
   </w:num>
   <w:num w:numId="9" w16cid:durableId="2110276410">
     <w:abstractNumId w:val="0"/>
+  </w:num>
+  <w:num w:numId="10" w16cid:durableId="880751730">
+    <w:abstractNumId w:val="10"/>
+  </w:num>
+  <w:num w:numId="11" w16cid:durableId="1843859880">
+    <w:abstractNumId w:val="3"/>
+  </w:num>
+  <w:num w:numId="12" w16cid:durableId="2082482964">
+    <w:abstractNumId w:val="2"/>
   </w:num>
 </w:numbering>
 </file>

</xml_diff>